<commit_message>
docs(kya): update Phase 4 edge targets (Win11, Intel Mac 2017) and DGX Ollama guidance
</commit_message>
<xml_diff>
--- a/Learn/2026-09-20-jev-kya-nemotron-distillation-plan.docx
+++ b/Learn/2026-09-20-jev-kya-nemotron-distillation-plan.docx
@@ -767,7 +767,7 @@
         <w:rPr>
           <w:rStyle w:val="VerbatimChar"/>
         </w:rPr>
-        <w:t xml:space="preserve">│  • Mac / Apple Silicon: MLX INT4 (~2.5 GB)                                       │</w:t>
+        <w:t xml:space="preserve">│  • Win 11 / PC: GGUF / ONNX / TensorRT-LLM (~2.5 GB)                             │</w:t>
       </w:r>
       <w:r>
         <w:br/>
@@ -776,7 +776,7 @@
         <w:rPr>
           <w:rStyle w:val="VerbatimChar"/>
         </w:rPr>
-        <w:t xml:space="preserve">│  • Paikalliset agentit: vLLM AWQ / FP8 (~22 ms latenssi)                         │</w:t>
+        <w:t xml:space="preserve">│  • Intel Mac (2017, 16 GB): GGUF / ONNX llama.cpp CPU (~2.5 GB)                  │</w:t>
       </w:r>
       <w:r>
         <w:br/>
@@ -785,6 +785,15 @@
         <w:rPr>
           <w:rStyle w:val="VerbatimChar"/>
         </w:rPr>
+        <w:t xml:space="preserve">│  • Paikalliset agentit: vLLM / TensorRT-LLM AWQ / FP8 (~22 ms)                  │</w:t>
+      </w:r>
+      <w:r>
+        <w:br/>
+      </w:r>
+      <w:r>
+        <w:rPr>
+          <w:rStyle w:val="VerbatimChar"/>
+        </w:rPr>
         <w:t xml:space="preserve">│                                                                                  │</w:t>
       </w:r>
       <w:r>
@@ -795,6 +804,48 @@
           <w:rStyle w:val="VerbatimChar"/>
         </w:rPr>
         <w:t xml:space="preserve">└──────────────────────────────────────────────────────────────────────────────────┘</w:t>
+      </w:r>
+    </w:p>
+    <w:p>
+      <w:pPr>
+        <w:pStyle w:val="BlockText"/>
+      </w:pPr>
+      <w:r>
+        <w:rPr>
+          <w:bCs/>
+          <w:b/>
+        </w:rPr>
+        <w:t xml:space="preserve">Huomio Ollama-malleista tislauksen aikana:</w:t>
+      </w:r>
+      <w:r>
+        <w:br/>
+      </w:r>
+      <w:r>
+        <w:t xml:space="preserve">DGX Sparkilla käytössä olevat Ollama-mallit puretaan GPU-muistista (</w:t>
+      </w:r>
+      <w:r>
+        <w:rPr>
+          <w:rStyle w:val="VerbatimChar"/>
+        </w:rPr>
+        <w:t xml:space="preserve">sudo systemctl stop ollama</w:t>
+      </w:r>
+      <w:r>
+        <w:t xml:space="preserve"> </w:t>
+      </w:r>
+      <w:r>
+        <w:t xml:space="preserve">tai</w:t>
+      </w:r>
+      <w:r>
+        <w:t xml:space="preserve"> </w:t>
+      </w:r>
+      <w:r>
+        <w:rPr>
+          <w:rStyle w:val="VerbatimChar"/>
+        </w:rPr>
+        <w:t xml:space="preserve">ollama stop &lt;malli&gt;</w:t>
+      </w:r>
+      <w:r>
+        <w:t xml:space="preserve">) vaiheiden 1 ja 2 ajaksi, jotta koko 128 GB yhdistetty muisti, Blackwell-kiihdyttimet ja massiivinen KV-välimuisti vapautuvat sataprosenttisesti Nemotron-4 340B -opettaja- ja arvioijamallien käyttöön ilman OOM-riskiä.</w:t>
       </w:r>
     </w:p>
     <w:bookmarkStart w:id="25" w:name="X82ec10aa15d0913c348c657c8d443ffc6ba7a6e"/>
@@ -844,13 +895,13 @@
           <w:bCs/>
           <w:b/>
         </w:rPr>
-        <w:t xml:space="preserve">Konfiguraatio:</w:t>
-      </w:r>
-      <w:r>
-        <w:t xml:space="preserve"> </w:t>
-      </w:r>
-      <w:r>
-        <w:t xml:space="preserve">Ladataan opettajamalli DGX Sparkiin käyttäen vLLM- tai TensorRT-LLM -moottoria hyödyntäen Blackwellin natiivia FP8-tarkkuutta.</w:t>
+        <w:t xml:space="preserve">Kokoonpano:</w:t>
+      </w:r>
+      <w:r>
+        <w:t xml:space="preserve"> </w:t>
+      </w:r>
+      <w:r>
+        <w:t xml:space="preserve">Ladataan opettajamalli DGX Sparkiin käyttäen vLLM- tai TensorRT-LLM -moottoria hyödyntäen Blackwellin natiivia FP8-tarkkuutta (VRAM ~340 GB virtuaalinen / paloiteltu tila).</w:t>
       </w:r>
     </w:p>
     <w:p>
@@ -872,7 +923,7 @@
         <w:t xml:space="preserve"> </w:t>
       </w:r>
       <w:r>
-        <w:t xml:space="preserve">Ajetaan satojatuhansia synteettisiä KYA-skenaarioita (Mandate, Attestation, validointi, poikkeustilanteet, turvallisuusrajaukset).</w:t>
+        <w:t xml:space="preserve">Ajetaan satojatuhansia synteettisiä KYA-skenaarioita (Mandate, Attestation, validointi, poikkeustilanteet, turvallisuusrajat).</w:t>
       </w:r>
     </w:p>
     <w:p>
@@ -894,7 +945,10 @@
         <w:t xml:space="preserve"> </w:t>
       </w:r>
       <w:r>
-        <w:t xml:space="preserve">Koska kyseessä on eräajo (offline batch processing) eikä reaaliaikainen vuorovaikutus, eräkoko säädetään maksimiin (</w:t>
+        <w:t xml:space="preserve">Offline-eräajossa maksimoidaan</w:t>
+      </w:r>
+      <w:r>
+        <w:t xml:space="preserve"> </w:t>
       </w:r>
       <w:r>
         <w:rPr>
@@ -903,7 +957,10 @@
         <w:t xml:space="preserve">max_num_batched_tokens</w:t>
       </w:r>
       <w:r>
-        <w:t xml:space="preserve">). DGX puskee synteettistä dataa levylle satojen tuhansien tokeneiden sekuntivauhdilla hyödyntäen massiivista KV-välimuistia.</w:t>
+        <w:t xml:space="preserve"> </w:t>
+      </w:r>
+      <w:r>
+        <w:t xml:space="preserve">ja hyödynnetään massiivista KV-välimuistia. DGX puskee synteettistä dataa levylle satojen tuhansien tokeneiden sekuntivauhdilla.</w:t>
       </w:r>
     </w:p>
     <w:p>
@@ -925,19 +982,7 @@
         <w:t xml:space="preserve"> </w:t>
       </w:r>
       <w:r>
-        <w:t xml:space="preserve">Kun generointi on valmis, GPU:n VRAM tyhjennetään kokonaan (</w:t>
-      </w:r>
-      <w:r>
-        <w:rPr>
-          <w:rStyle w:val="VerbatimChar"/>
-        </w:rPr>
-        <w:t xml:space="preserve">torch.cuda.empty_cache()</w:t>
-      </w:r>
-      <w:r>
-        <w:t xml:space="preserve"> </w:t>
-      </w:r>
-      <w:r>
-        <w:t xml:space="preserve">/ prosessin sulkeminen).</w:t>
+        <w:t xml:space="preserve">Kun generointi on valmis, GPU:n VRAM tyhjennetään kokonaan.</w:t>
       </w:r>
     </w:p>
     <w:bookmarkEnd w:id="25"/>
@@ -988,13 +1033,13 @@
           <w:bCs/>
           <w:b/>
         </w:rPr>
-        <w:t xml:space="preserve">Konfiguraatio:</w:t>
-      </w:r>
-      <w:r>
-        <w:t xml:space="preserve"> </w:t>
-      </w:r>
-      <w:r>
-        <w:t xml:space="preserve">Ladataan DGX Sparkin muistiin arvioijamalli (Reward model).</w:t>
+        <w:t xml:space="preserve">Kokoonpano:</w:t>
+      </w:r>
+      <w:r>
+        <w:t xml:space="preserve"> </w:t>
+      </w:r>
+      <w:r>
+        <w:t xml:space="preserve">Ladataan arvioijamalli VRAMiin.</w:t>
       </w:r>
     </w:p>
     <w:p>
@@ -1038,7 +1083,19 @@
         <w:t xml:space="preserve"> </w:t>
       </w:r>
       <w:r>
-        <w:t xml:space="preserve">Malli antaa jokaiselle ratkaisulle laatupisteet (asteikko 0–100). Hylätään kaikki paitsi täydelliset suoritukset (esim. top 10–20 %). Tämä suodatus karsii synteettisen kohinan ja luo virheettömän opetusaineiston, joka keskittyy tiukasti vain Jev-KYA -konformanssiin.</w:t>
+        <w:t xml:space="preserve">LLM-as-a-Judge pisteytys (asteikko 0–100). Hylätään kaikki paitsi täydelliset suoritukset (top 10–20 %), luoden virheetön ~50 000 laadukkaan päätöksen</w:t>
+      </w:r>
+      <w:r>
+        <w:t xml:space="preserve"> </w:t>
+      </w:r>
+      <w:r>
+        <w:rPr>
+          <w:rStyle w:val="VerbatimChar"/>
+        </w:rPr>
+        <w:t xml:space="preserve">.jsonl</w:t>
+      </w:r>
+      <w:r>
+        <w:t xml:space="preserve">-dataset, joka keskittyy tiukasti Jev-KYA-konformanssiin.</w:t>
       </w:r>
     </w:p>
     <w:p>
@@ -1060,7 +1117,7 @@
         <w:t xml:space="preserve"> </w:t>
       </w:r>
       <w:r>
-        <w:t xml:space="preserve">Aineisto tallennetaan validoituna</w:t>
+        <w:t xml:space="preserve">Aineisto tallennetaan</w:t>
       </w:r>
       <w:r>
         <w:t xml:space="preserve"> </w:t>
@@ -1072,7 +1129,7 @@
         <w:t xml:space="preserve">.jsonl</w:t>
       </w:r>
       <w:r>
-        <w:t xml:space="preserve">-tiedostona levylle, ja GPU:n VRAM vapautetaan seuraavaa vaihetta varten.</w:t>
+        <w:t xml:space="preserve">-tiedostona levylle ja VRAM tyhjennetään.</w:t>
       </w:r>
     </w:p>
     <w:bookmarkEnd w:id="26"/>
@@ -1104,7 +1161,7 @@
         <w:t xml:space="preserve"> </w:t>
       </w:r>
       <w:r>
-        <w:t xml:space="preserve">4B-pohjamalli (esimerkiksi</w:t>
+        <w:t xml:space="preserve">4B-pohjamalli (esim.</w:t>
       </w:r>
       <w:r>
         <w:t xml:space="preserve"> </w:t>
@@ -1116,10 +1173,7 @@
         <w:t xml:space="preserve">Llama-3.2-3B</w:t>
       </w:r>
       <w:r>
-        <w:t xml:space="preserve"> </w:t>
-      </w:r>
-      <w:r>
-        <w:t xml:space="preserve">tai vastaava moderni arkkitehtuuri).</w:t>
+        <w:t xml:space="preserve">).</w:t>
       </w:r>
     </w:p>
     <w:p>
@@ -1135,13 +1189,13 @@
           <w:bCs/>
           <w:b/>
         </w:rPr>
-        <w:t xml:space="preserve">Konfiguraatio:</w:t>
-      </w:r>
-      <w:r>
-        <w:t xml:space="preserve"> </w:t>
-      </w:r>
-      <w:r>
-        <w:t xml:space="preserve">Ladataan 4B-malli DGX Sparkiin. Koska 4B-kokoluokan malli on erittäin kevyt suhteessa Blackwell-laitteiston kapasiteettiin (BF16-painot ja optimointitila vain ~8–10 GB), koulutus voidaan ajaa täytenä hienosäätönä (</w:t>
+        <w:t xml:space="preserve">Kokoonpano:</w:t>
+      </w:r>
+      <w:r>
+        <w:t xml:space="preserve"> </w:t>
+      </w:r>
+      <w:r>
+        <w:t xml:space="preserve">Koulutus ajetaan täytenä hienosäätönä (</w:t>
       </w:r>
       <w:r>
         <w:rPr>
@@ -1151,7 +1205,7 @@
         <w:t xml:space="preserve">Full Parameter Fine-Tuning</w:t>
       </w:r>
       <w:r>
-        <w:t xml:space="preserve">), ei ainoastaan rajoitettuna LoRA/QLoRA-adapterina.</w:t>
+        <w:t xml:space="preserve">, BF16) FSDP / Data Parallelism -menetelmällä kaikille DGX-ytimille.</w:t>
       </w:r>
     </w:p>
     <w:p>
@@ -1167,35 +1221,13 @@
           <w:bCs/>
           <w:b/>
         </w:rPr>
-        <w:t xml:space="preserve">Ajo:</w:t>
-      </w:r>
-      <w:r>
-        <w:t xml:space="preserve"> </w:t>
-      </w:r>
-      <w:r>
-        <w:t xml:space="preserve">Koulutus jaetaan DGX Sparkin GPU-ytimille hyödyntäen Data Parallelism / FSDP -menetelmiä.</w:t>
-      </w:r>
-    </w:p>
-    <w:p>
-      <w:pPr>
-        <w:numPr>
-          <w:ilvl w:val="0"/>
-          <w:numId w:val="1005"/>
-        </w:numPr>
-        <w:pStyle w:val="Compact"/>
-      </w:pPr>
-      <w:r>
-        <w:rPr>
-          <w:bCs/>
-          <w:b/>
-        </w:rPr>
         <w:t xml:space="preserve">Nopeus:</w:t>
       </w:r>
       <w:r>
         <w:t xml:space="preserve"> </w:t>
       </w:r>
       <w:r>
-        <w:t xml:space="preserve">Pienen mallin koulutus järeällä laskintalla saavuttaa äärimmäisen korkean läpimenon. 2–3 epookin (epoch) ajaminen noin 50 000 kultastandardin KYA-näytteellä kestää vain 2–4 tuntia.</w:t>
+        <w:t xml:space="preserve">Pienen mallin koulutus järeällä Blackwell-raudalla on äärimmäisen nopeaa — 2–3 epookin ajo kestää vain 2–4 tuntia.</w:t>
       </w:r>
     </w:p>
     <w:bookmarkEnd w:id="27"/>
@@ -1221,14 +1253,20 @@
           <w:bCs/>
           <w:b/>
         </w:rPr>
-        <w:t xml:space="preserve">Päätepisteet ja formaatit:</w:t>
+        <w:t xml:space="preserve">Windows 11 / PC-reunalaitteet:</w:t>
+      </w:r>
+      <w:r>
+        <w:t xml:space="preserve"> </w:t>
+      </w:r>
+      <w:r>
+        <w:t xml:space="preserve">GGUF / ONNX / TensorRT-LLM Windows-tuella (~2.5 GB).</w:t>
       </w:r>
     </w:p>
     <w:p>
       <w:pPr>
         <w:numPr>
-          <w:ilvl w:val="1"/>
-          <w:numId w:val="1007"/>
+          <w:ilvl w:val="0"/>
+          <w:numId w:val="1006"/>
         </w:numPr>
         <w:pStyle w:val="Compact"/>
       </w:pPr>
@@ -1237,20 +1275,32 @@
           <w:bCs/>
           <w:b/>
         </w:rPr>
-        <w:t xml:space="preserve">Mac / Apple Silicon:</w:t>
-      </w:r>
-      <w:r>
-        <w:t xml:space="preserve"> </w:t>
-      </w:r>
-      <w:r>
-        <w:t xml:space="preserve">Muunnetaan malli MLX-yhteensopivaan muotoon ja kvantisoidaan 4-bittiseksi (INT4). Tuloksena on noin 2.5 GB kokoinen itsenäinen mallitiedosto, joka toimii M-sarjan prosessoreilla minimaalisella muistijalanjäljellä.</w:t>
+        <w:t xml:space="preserve">Intel Mac (2017, 16 GB RAM):</w:t>
+      </w:r>
+      <w:r>
+        <w:t xml:space="preserve"> </w:t>
+      </w:r>
+      <w:r>
+        <w:t xml:space="preserve">GGUF / ONNX -muoto</w:t>
+      </w:r>
+      <w:r>
+        <w:t xml:space="preserve"> </w:t>
+      </w:r>
+      <w:r>
+        <w:rPr>
+          <w:rStyle w:val="VerbatimChar"/>
+        </w:rPr>
+        <w:t xml:space="preserve">llama.cpp</w:t>
+      </w:r>
+      <w:r>
+        <w:t xml:space="preserve">:n kautta CPU-päättelyllä (~2.5 GB).</w:t>
       </w:r>
     </w:p>
     <w:p>
       <w:pPr>
         <w:numPr>
-          <w:ilvl w:val="1"/>
-          <w:numId w:val="1007"/>
+          <w:ilvl w:val="0"/>
+          <w:numId w:val="1006"/>
         </w:numPr>
         <w:pStyle w:val="Compact"/>
       </w:pPr>
@@ -1259,13 +1309,13 @@
           <w:bCs/>
           <w:b/>
         </w:rPr>
-        <w:t xml:space="preserve">Lokaalit Agentti-GPU:t / Teollisuusreuna:</w:t>
-      </w:r>
-      <w:r>
-        <w:t xml:space="preserve"> </w:t>
-      </w:r>
-      <w:r>
-        <w:t xml:space="preserve">Exportataan malli vLLM- ja TensorRT-LLM -yhteensopivaan AWQ- tai FP8-muotoon, jolla saavutetaan reaaliaikainen ~22 ms latenssi päätöstä kohti.</w:t>
+        <w:t xml:space="preserve">Paikalliset agentit / Teollisuus-GPU:t:</w:t>
+      </w:r>
+      <w:r>
+        <w:t xml:space="preserve"> </w:t>
+      </w:r>
+      <w:r>
+        <w:t xml:space="preserve">vLLM / TensorRT-LLM AWQ / FP8 (~22 ms latenssi päätöstä kohti).</w:t>
       </w:r>
     </w:p>
     <w:p>
@@ -1318,7 +1368,7 @@
       <w:pPr>
         <w:numPr>
           <w:ilvl w:val="0"/>
-          <w:numId w:val="1008"/>
+          <w:numId w:val="1007"/>
         </w:numPr>
         <w:pStyle w:val="Compact"/>
       </w:pPr>
@@ -1340,7 +1390,7 @@
       <w:pPr>
         <w:numPr>
           <w:ilvl w:val="0"/>
-          <w:numId w:val="1008"/>
+          <w:numId w:val="1007"/>
         </w:numPr>
         <w:pStyle w:val="Compact"/>
       </w:pPr>
@@ -1362,7 +1412,7 @@
       <w:pPr>
         <w:numPr>
           <w:ilvl w:val="0"/>
-          <w:numId w:val="1008"/>
+          <w:numId w:val="1007"/>
         </w:numPr>
         <w:pStyle w:val="Compact"/>
       </w:pPr>
@@ -1920,36 +1970,6 @@
     <w:abstractNumId w:val="991"/>
   </w:num>
   <w:num w:numId="1007">
-    <w:abstractNumId w:val="99411"/>
-    <w:lvlOverride w:ilvl="0">
-      <w:startOverride w:val="1"/>
-    </w:lvlOverride>
-    <w:lvlOverride w:ilvl="1">
-      <w:startOverride w:val="1"/>
-    </w:lvlOverride>
-    <w:lvlOverride w:ilvl="2">
-      <w:startOverride w:val="1"/>
-    </w:lvlOverride>
-    <w:lvlOverride w:ilvl="3">
-      <w:startOverride w:val="1"/>
-    </w:lvlOverride>
-    <w:lvlOverride w:ilvl="4">
-      <w:startOverride w:val="1"/>
-    </w:lvlOverride>
-    <w:lvlOverride w:ilvl="5">
-      <w:startOverride w:val="1"/>
-    </w:lvlOverride>
-    <w:lvlOverride w:ilvl="6">
-      <w:startOverride w:val="1"/>
-    </w:lvlOverride>
-    <w:lvlOverride w:ilvl="7">
-      <w:startOverride w:val="1"/>
-    </w:lvlOverride>
-    <w:lvlOverride w:ilvl="8">
-      <w:startOverride w:val="1"/>
-    </w:lvlOverride>
-  </w:num>
-  <w:num w:numId="1008">
     <w:abstractNumId w:val="991"/>
   </w:num>
 </w:numbering>

</xml_diff>